<commit_message>
docs: insert Zenodo DOI 10.5281/zenodo.23285905 in all outputs
- README.md: DOI badge added below title
- libro_completo.docx: DOI line inserted after ORCID on cover page
- paper_sciagent_v3.docx: "DOI pendiente" replaced with final DOI

Published: https://doi.org/10.5281/zenodo.23285905
Version: 3.0.0 — 10 October 2026

Co-Authored-By: Claude Sonnet 4.6 <noreply@anthropic.com>
Claude-Session: https://claude.ai/code/session_01KgQSESh3DhPz1VmZvKj2Lm
</commit_message>
<xml_diff>
--- a/libro_completo.docx
+++ b/libro_completo.docx
@@ -114,6 +114,14 @@
           <w:szCs w:val="20"/>
         </w:rPr>
         <w:t xml:space="preserve">ORCID: 0000-0002-7105-620X</w:t>
+      </w:r>
+    </w:p>
+    <w:p>
+      <w:pPr>
+        <w:jc w:val="center"/>
+      </w:pPr>
+      <w:r>
+        <w:t xml:space="preserve">DOI: 10.5281/zenodo.23285905 — https://doi.org/10.5281/zenodo.23285905</w:t>
       </w:r>
     </w:p>
     <w:p>

</xml_diff>